<commit_message>
fit TID preview to modal width instead of fixed page width
</commit_message>
<xml_diff>
--- a/src/assets/tid/tidTemplate.docx
+++ b/src/assets/tid/tidTemplate.docx
@@ -284,23 +284,24 @@
     </w:p>
     <w:tbl>
       <w:tblPr>
-        <w:tblW w:w="14454" w:type="dxa"/>
-        <w:tblLayout w:type="fixed"/>
+        <w:tblW w:w="5000" w:type="pct"/>
+        <w:jc w:val="center"/>
         <w:tblLook w:val="00A0" w:firstRow="1" w:lastRow="0" w:firstColumn="1" w:lastColumn="0" w:noHBand="0" w:noVBand="0"/>
       </w:tblPr>
       <w:tblGrid>
-        <w:gridCol w:w="454"/>
-        <w:gridCol w:w="4361"/>
-        <w:gridCol w:w="4819"/>
-        <w:gridCol w:w="4820"/>
+        <w:gridCol w:w="462"/>
+        <w:gridCol w:w="4304"/>
+        <w:gridCol w:w="4755"/>
+        <w:gridCol w:w="4756"/>
       </w:tblGrid>
       <w:tr>
         <w:trPr>
           <w:tblHeader/>
+          <w:jc w:val="center"/>
         </w:trPr>
         <w:tc>
           <w:tcPr>
-            <w:tcW w:w="454" w:type="dxa"/>
+            <w:tcW w:w="157" w:type="pct"/>
             <w:tcBorders>
               <w:top w:val="single" w:sz="4" w:space="0" w:color="auto"/>
               <w:left w:val="single" w:sz="4" w:space="0" w:color="auto"/>
@@ -329,7 +330,7 @@
         </w:tc>
         <w:tc>
           <w:tcPr>
-            <w:tcW w:w="4361" w:type="dxa"/>
+            <w:tcW w:w="1509" w:type="pct"/>
             <w:tcBorders>
               <w:top w:val="single" w:sz="4" w:space="0" w:color="auto"/>
               <w:left w:val="single" w:sz="4" w:space="0" w:color="auto"/>
@@ -358,7 +359,7 @@
         </w:tc>
         <w:tc>
           <w:tcPr>
-            <w:tcW w:w="4819" w:type="dxa"/>
+            <w:tcW w:w="1667" w:type="pct"/>
             <w:tcBorders>
               <w:top w:val="single" w:sz="4" w:space="0" w:color="auto"/>
               <w:left w:val="single" w:sz="4" w:space="0" w:color="auto"/>
@@ -388,7 +389,7 @@
         </w:tc>
         <w:tc>
           <w:tcPr>
-            <w:tcW w:w="4820" w:type="dxa"/>
+            <w:tcW w:w="1667" w:type="pct"/>
             <w:tcBorders>
               <w:top w:val="single" w:sz="4" w:space="0" w:color="auto"/>
               <w:left w:val="single" w:sz="4" w:space="0" w:color="auto"/>
@@ -419,10 +420,11 @@
       <w:tr>
         <w:trPr>
           <w:trHeight w:val="2394"/>
+          <w:jc w:val="center"/>
         </w:trPr>
         <w:tc>
           <w:tcPr>
-            <w:tcW w:w="454" w:type="dxa"/>
+            <w:tcW w:w="157" w:type="pct"/>
             <w:tcBorders>
               <w:top w:val="single" w:sz="4" w:space="0" w:color="auto"/>
               <w:left w:val="single" w:sz="4" w:space="0" w:color="auto"/>
@@ -448,7 +450,7 @@
         </w:tc>
         <w:tc>
           <w:tcPr>
-            <w:tcW w:w="4361" w:type="dxa"/>
+            <w:tcW w:w="1509" w:type="pct"/>
             <w:tcBorders>
               <w:top w:val="single" w:sz="4" w:space="0" w:color="auto"/>
               <w:left w:val="single" w:sz="4" w:space="0" w:color="auto"/>
@@ -465,7 +467,7 @@
         </w:tc>
         <w:tc>
           <w:tcPr>
-            <w:tcW w:w="4819" w:type="dxa"/>
+            <w:tcW w:w="1667" w:type="pct"/>
             <w:tcBorders>
               <w:top w:val="single" w:sz="4" w:space="0" w:color="auto"/>
               <w:left w:val="single" w:sz="4" w:space="0" w:color="auto"/>
@@ -485,7 +487,7 @@
         </w:tc>
         <w:tc>
           <w:tcPr>
-            <w:tcW w:w="4820" w:type="dxa"/>
+            <w:tcW w:w="1667" w:type="pct"/>
             <w:tcBorders>
               <w:top w:val="single" w:sz="4" w:space="0" w:color="auto"/>
               <w:left w:val="single" w:sz="4" w:space="0" w:color="auto"/>
@@ -2734,6 +2736,7 @@
     <w:lsdException w:name="HTML Sample" w:semiHidden="1" w:unhideWhenUsed="1"/>
     <w:lsdException w:name="HTML Typewriter" w:semiHidden="1" w:unhideWhenUsed="1"/>
     <w:lsdException w:name="HTML Variable" w:semiHidden="1" w:unhideWhenUsed="1"/>
+    <w:lsdException w:name="Normal Table" w:semiHidden="1" w:unhideWhenUsed="1"/>
     <w:lsdException w:name="annotation subject" w:semiHidden="1" w:unhideWhenUsed="1"/>
     <w:lsdException w:name="No List" w:semiHidden="1" w:unhideWhenUsed="1"/>
     <w:lsdException w:name="Outline List 1" w:semiHidden="1" w:unhideWhenUsed="1"/>
@@ -2780,8 +2783,10 @@
     <w:lsdException w:name="Table Subtle 2" w:semiHidden="1" w:unhideWhenUsed="1"/>
     <w:lsdException w:name="Table Web 1" w:semiHidden="1" w:unhideWhenUsed="1"/>
     <w:lsdException w:name="Table Web 2" w:semiHidden="1" w:unhideWhenUsed="1"/>
+    <w:lsdException w:name="Table Web 3" w:semiHidden="1" w:unhideWhenUsed="1"/>
     <w:lsdException w:name="Balloon Text" w:semiHidden="1" w:unhideWhenUsed="1"/>
     <w:lsdException w:name="Table Grid" w:uiPriority="39"/>
+    <w:lsdException w:name="Table Theme" w:semiHidden="1" w:unhideWhenUsed="1"/>
     <w:lsdException w:name="Placeholder Text" w:semiHidden="1"/>
     <w:lsdException w:name="No Spacing" w:uiPriority="1" w:qFormat="1"/>
     <w:lsdException w:name="Light Shading" w:uiPriority="60"/>

</xml_diff>